<commit_message>
implemented class wise fees structure
</commit_message>
<xml_diff>
--- a/to-do list.docx
+++ b/to-do list.docx
@@ -422,6 +422,14 @@
                 <w:szCs w:val="44"/>
               </w:rPr>
             </w:pPr>
+            <w:r>
+              <w:rPr>
+                <w:rFonts w:ascii="Segoe UI Emoji" w:hAnsi="Segoe UI Emoji" w:cs="Segoe UI Emoji"/>
+                <w:sz w:val="44"/>
+                <w:szCs w:val="44"/>
+              </w:rPr>
+              <w:t>✅</w:t>
+            </w:r>
           </w:p>
         </w:tc>
       </w:tr>
@@ -553,6 +561,7 @@
     <w:p/>
     <w:p>
       <w:r>
+        <w:lastRenderedPageBreak/>
         <w:t xml:space="preserve">the tabular structure which contains the following fee amount </w:t>
       </w:r>
       <w:proofErr w:type="gramStart"/>
@@ -563,7 +572,6 @@
     </w:p>
     <w:p>
       <w:r>
-        <w:lastRenderedPageBreak/>
         <w:t>school fees due</w:t>
       </w:r>
     </w:p>
@@ -589,6 +597,9 @@
     </w:p>
     <w:p>
       <w:r>
+        <w:rPr>
+          <w:noProof/>
+        </w:rPr>
         <w:lastRenderedPageBreak/>
         <w:drawing>
           <wp:inline distT="0" distB="0" distL="0" distR="0" wp14:anchorId="202FBCC1" wp14:editId="11A0DE2A">
@@ -1321,6 +1332,7 @@
   <w:style w:type="character" w:default="1" w:styleId="DefaultParagraphFont">
     <w:name w:val="Default Paragraph Font"/>
     <w:uiPriority w:val="1"/>
+    <w:semiHidden/>
     <w:unhideWhenUsed/>
   </w:style>
   <w:style w:type="table" w:default="1" w:styleId="TableNormal">

</xml_diff>

<commit_message>
added dynamic van fees
</commit_message>
<xml_diff>
--- a/to-do list.docx
+++ b/to-do list.docx
@@ -305,7 +305,6 @@
           </w:tcPr>
           <w:p>
             <w:pPr>
-              <w:jc w:val="center"/>
               <w:rPr>
                 <w:sz w:val="44"/>
                 <w:szCs w:val="44"/>
@@ -453,6 +452,384 @@
               </w:rPr>
               <w:t>Dynamic Vam Fees</w:t>
             </w:r>
+          </w:p>
+        </w:tc>
+        <w:tc>
+          <w:tcPr>
+            <w:tcW w:w="4508" w:type="dxa"/>
+          </w:tcPr>
+          <w:p>
+            <w:pPr>
+              <w:jc w:val="center"/>
+              <w:rPr>
+                <w:rFonts w:ascii="Segoe UI Emoji" w:hAnsi="Segoe UI Emoji" w:cs="Segoe UI Emoji"/>
+                <w:sz w:val="44"/>
+                <w:szCs w:val="44"/>
+              </w:rPr>
+            </w:pPr>
+            <w:r>
+              <w:rPr>
+                <w:rFonts w:ascii="Segoe UI Emoji" w:hAnsi="Segoe UI Emoji" w:cs="Segoe UI Emoji"/>
+                <w:sz w:val="44"/>
+                <w:szCs w:val="44"/>
+              </w:rPr>
+              <w:t>✅</w:t>
+            </w:r>
+          </w:p>
+        </w:tc>
+      </w:tr>
+      <w:tr>
+        <w:tc>
+          <w:tcPr>
+            <w:tcW w:w="4508" w:type="dxa"/>
+          </w:tcPr>
+          <w:p>
+            <w:pPr>
+              <w:jc w:val="center"/>
+              <w:rPr>
+                <w:sz w:val="44"/>
+                <w:szCs w:val="44"/>
+              </w:rPr>
+            </w:pPr>
+            <w:r>
+              <w:rPr>
+                <w:sz w:val="44"/>
+                <w:szCs w:val="44"/>
+              </w:rPr>
+              <w:t>Payment History</w:t>
+            </w:r>
+          </w:p>
+        </w:tc>
+        <w:tc>
+          <w:tcPr>
+            <w:tcW w:w="4508" w:type="dxa"/>
+          </w:tcPr>
+          <w:p>
+            <w:pPr>
+              <w:jc w:val="center"/>
+              <w:rPr>
+                <w:rFonts w:ascii="Segoe UI Emoji" w:hAnsi="Segoe UI Emoji" w:cs="Segoe UI Emoji"/>
+                <w:sz w:val="44"/>
+                <w:szCs w:val="44"/>
+              </w:rPr>
+            </w:pPr>
+          </w:p>
+        </w:tc>
+      </w:tr>
+      <w:tr>
+        <w:tc>
+          <w:tcPr>
+            <w:tcW w:w="4508" w:type="dxa"/>
+          </w:tcPr>
+          <w:p>
+            <w:pPr>
+              <w:jc w:val="center"/>
+              <w:rPr>
+                <w:sz w:val="44"/>
+                <w:szCs w:val="44"/>
+              </w:rPr>
+            </w:pPr>
+            <w:r>
+              <w:rPr>
+                <w:sz w:val="44"/>
+                <w:szCs w:val="44"/>
+              </w:rPr>
+              <w:t>Reference number generation</w:t>
+            </w:r>
+          </w:p>
+        </w:tc>
+        <w:tc>
+          <w:tcPr>
+            <w:tcW w:w="4508" w:type="dxa"/>
+          </w:tcPr>
+          <w:p>
+            <w:pPr>
+              <w:jc w:val="center"/>
+              <w:rPr>
+                <w:rFonts w:ascii="Segoe UI Emoji" w:hAnsi="Segoe UI Emoji" w:cs="Segoe UI Emoji"/>
+                <w:sz w:val="44"/>
+                <w:szCs w:val="44"/>
+              </w:rPr>
+            </w:pPr>
+            <w:r>
+              <w:rPr>
+                <w:rFonts w:ascii="Segoe UI Emoji" w:hAnsi="Segoe UI Emoji" w:cs="Segoe UI Emoji"/>
+                <w:sz w:val="44"/>
+                <w:szCs w:val="44"/>
+              </w:rPr>
+              <w:t>✅</w:t>
+            </w:r>
+          </w:p>
+        </w:tc>
+      </w:tr>
+      <w:tr>
+        <w:tc>
+          <w:tcPr>
+            <w:tcW w:w="4508" w:type="dxa"/>
+          </w:tcPr>
+          <w:p>
+            <w:pPr>
+              <w:jc w:val="center"/>
+              <w:rPr>
+                <w:sz w:val="44"/>
+                <w:szCs w:val="44"/>
+              </w:rPr>
+            </w:pPr>
+            <w:r>
+              <w:rPr>
+                <w:sz w:val="44"/>
+                <w:szCs w:val="44"/>
+              </w:rPr>
+              <w:t>Add filtering features to payment history</w:t>
+            </w:r>
+          </w:p>
+        </w:tc>
+        <w:tc>
+          <w:tcPr>
+            <w:tcW w:w="4508" w:type="dxa"/>
+          </w:tcPr>
+          <w:p>
+            <w:pPr>
+              <w:jc w:val="center"/>
+              <w:rPr>
+                <w:rFonts w:ascii="Segoe UI Emoji" w:hAnsi="Segoe UI Emoji" w:cs="Segoe UI Emoji"/>
+                <w:sz w:val="44"/>
+                <w:szCs w:val="44"/>
+              </w:rPr>
+            </w:pPr>
+          </w:p>
+        </w:tc>
+      </w:tr>
+      <w:tr>
+        <w:tc>
+          <w:tcPr>
+            <w:tcW w:w="4508" w:type="dxa"/>
+          </w:tcPr>
+          <w:p>
+            <w:pPr>
+              <w:jc w:val="center"/>
+              <w:rPr>
+                <w:sz w:val="44"/>
+                <w:szCs w:val="44"/>
+              </w:rPr>
+            </w:pPr>
+          </w:p>
+        </w:tc>
+        <w:tc>
+          <w:tcPr>
+            <w:tcW w:w="4508" w:type="dxa"/>
+          </w:tcPr>
+          <w:p>
+            <w:pPr>
+              <w:jc w:val="center"/>
+              <w:rPr>
+                <w:rFonts w:ascii="Segoe UI Emoji" w:hAnsi="Segoe UI Emoji" w:cs="Segoe UI Emoji"/>
+                <w:sz w:val="44"/>
+                <w:szCs w:val="44"/>
+              </w:rPr>
+            </w:pPr>
+          </w:p>
+        </w:tc>
+      </w:tr>
+      <w:tr>
+        <w:tc>
+          <w:tcPr>
+            <w:tcW w:w="4508" w:type="dxa"/>
+          </w:tcPr>
+          <w:p>
+            <w:pPr>
+              <w:jc w:val="center"/>
+              <w:rPr>
+                <w:sz w:val="44"/>
+                <w:szCs w:val="44"/>
+              </w:rPr>
+            </w:pPr>
+          </w:p>
+        </w:tc>
+        <w:tc>
+          <w:tcPr>
+            <w:tcW w:w="4508" w:type="dxa"/>
+          </w:tcPr>
+          <w:p>
+            <w:pPr>
+              <w:jc w:val="center"/>
+              <w:rPr>
+                <w:rFonts w:ascii="Segoe UI Emoji" w:hAnsi="Segoe UI Emoji" w:cs="Segoe UI Emoji"/>
+                <w:sz w:val="44"/>
+                <w:szCs w:val="44"/>
+              </w:rPr>
+            </w:pPr>
+          </w:p>
+        </w:tc>
+      </w:tr>
+      <w:tr>
+        <w:tc>
+          <w:tcPr>
+            <w:tcW w:w="4508" w:type="dxa"/>
+          </w:tcPr>
+          <w:p>
+            <w:pPr>
+              <w:jc w:val="center"/>
+              <w:rPr>
+                <w:sz w:val="44"/>
+                <w:szCs w:val="44"/>
+              </w:rPr>
+            </w:pPr>
+          </w:p>
+        </w:tc>
+        <w:tc>
+          <w:tcPr>
+            <w:tcW w:w="4508" w:type="dxa"/>
+          </w:tcPr>
+          <w:p>
+            <w:pPr>
+              <w:jc w:val="center"/>
+              <w:rPr>
+                <w:rFonts w:ascii="Segoe UI Emoji" w:hAnsi="Segoe UI Emoji" w:cs="Segoe UI Emoji"/>
+                <w:sz w:val="44"/>
+                <w:szCs w:val="44"/>
+              </w:rPr>
+            </w:pPr>
+          </w:p>
+        </w:tc>
+      </w:tr>
+      <w:tr>
+        <w:tc>
+          <w:tcPr>
+            <w:tcW w:w="4508" w:type="dxa"/>
+          </w:tcPr>
+          <w:p>
+            <w:pPr>
+              <w:jc w:val="center"/>
+              <w:rPr>
+                <w:sz w:val="44"/>
+                <w:szCs w:val="44"/>
+              </w:rPr>
+            </w:pPr>
+          </w:p>
+        </w:tc>
+        <w:tc>
+          <w:tcPr>
+            <w:tcW w:w="4508" w:type="dxa"/>
+          </w:tcPr>
+          <w:p>
+            <w:pPr>
+              <w:jc w:val="center"/>
+              <w:rPr>
+                <w:rFonts w:ascii="Segoe UI Emoji" w:hAnsi="Segoe UI Emoji" w:cs="Segoe UI Emoji"/>
+                <w:sz w:val="44"/>
+                <w:szCs w:val="44"/>
+              </w:rPr>
+            </w:pPr>
+          </w:p>
+        </w:tc>
+      </w:tr>
+      <w:tr>
+        <w:tc>
+          <w:tcPr>
+            <w:tcW w:w="4508" w:type="dxa"/>
+          </w:tcPr>
+          <w:p>
+            <w:pPr>
+              <w:jc w:val="center"/>
+              <w:rPr>
+                <w:sz w:val="44"/>
+                <w:szCs w:val="44"/>
+              </w:rPr>
+            </w:pPr>
+          </w:p>
+        </w:tc>
+        <w:tc>
+          <w:tcPr>
+            <w:tcW w:w="4508" w:type="dxa"/>
+          </w:tcPr>
+          <w:p>
+            <w:pPr>
+              <w:jc w:val="center"/>
+              <w:rPr>
+                <w:rFonts w:ascii="Segoe UI Emoji" w:hAnsi="Segoe UI Emoji" w:cs="Segoe UI Emoji"/>
+                <w:sz w:val="44"/>
+                <w:szCs w:val="44"/>
+              </w:rPr>
+            </w:pPr>
+          </w:p>
+        </w:tc>
+      </w:tr>
+      <w:tr>
+        <w:tc>
+          <w:tcPr>
+            <w:tcW w:w="4508" w:type="dxa"/>
+          </w:tcPr>
+          <w:p>
+            <w:pPr>
+              <w:jc w:val="center"/>
+              <w:rPr>
+                <w:sz w:val="44"/>
+                <w:szCs w:val="44"/>
+              </w:rPr>
+            </w:pPr>
+          </w:p>
+        </w:tc>
+        <w:tc>
+          <w:tcPr>
+            <w:tcW w:w="4508" w:type="dxa"/>
+          </w:tcPr>
+          <w:p>
+            <w:pPr>
+              <w:jc w:val="center"/>
+              <w:rPr>
+                <w:rFonts w:ascii="Segoe UI Emoji" w:hAnsi="Segoe UI Emoji" w:cs="Segoe UI Emoji"/>
+                <w:sz w:val="44"/>
+                <w:szCs w:val="44"/>
+              </w:rPr>
+            </w:pPr>
+          </w:p>
+        </w:tc>
+      </w:tr>
+      <w:tr>
+        <w:tc>
+          <w:tcPr>
+            <w:tcW w:w="4508" w:type="dxa"/>
+          </w:tcPr>
+          <w:p>
+            <w:pPr>
+              <w:jc w:val="center"/>
+              <w:rPr>
+                <w:sz w:val="44"/>
+                <w:szCs w:val="44"/>
+              </w:rPr>
+            </w:pPr>
+          </w:p>
+        </w:tc>
+        <w:tc>
+          <w:tcPr>
+            <w:tcW w:w="4508" w:type="dxa"/>
+          </w:tcPr>
+          <w:p>
+            <w:pPr>
+              <w:jc w:val="center"/>
+              <w:rPr>
+                <w:rFonts w:ascii="Segoe UI Emoji" w:hAnsi="Segoe UI Emoji" w:cs="Segoe UI Emoji"/>
+                <w:sz w:val="44"/>
+                <w:szCs w:val="44"/>
+              </w:rPr>
+            </w:pPr>
+          </w:p>
+        </w:tc>
+      </w:tr>
+      <w:tr>
+        <w:tc>
+          <w:tcPr>
+            <w:tcW w:w="4508" w:type="dxa"/>
+          </w:tcPr>
+          <w:p>
+            <w:pPr>
+              <w:jc w:val="center"/>
+              <w:rPr>
+                <w:sz w:val="44"/>
+                <w:szCs w:val="44"/>
+              </w:rPr>
+            </w:pPr>
           </w:p>
         </w:tc>
         <w:tc>
@@ -503,7 +880,7 @@
     </w:p>
     <w:p>
       <w:r>
-        <w:t>task:-</w:t>
+        <w:t>##task:-</w:t>
       </w:r>
     </w:p>
     <w:p>
@@ -513,7 +890,7 @@
     </w:p>
     <w:p>
       <w:r>
-        <w:t>purpose of this button:-</w:t>
+        <w:t>##purpose of this button:-</w:t>
       </w:r>
     </w:p>
     <w:p>
@@ -529,7 +906,13 @@
     <w:p/>
     <w:p>
       <w:r>
-        <w:t>include:-</w:t>
+        <w:t xml:space="preserve">##structure of the recipt </w:t>
+      </w:r>
+    </w:p>
+    <w:p/>
+    <w:p>
+      <w:r>
+        <w:t>#include:-</w:t>
       </w:r>
     </w:p>
     <w:p>
@@ -539,40 +922,98 @@
     </w:p>
     <w:p>
       <w:r>
-        <w:t>student information (roll number,name,gardian name)</w:t>
+        <w:t>the generated recipt number for that recipt</w:t>
+      </w:r>
+    </w:p>
+    <w:p>
+      <w:r>
+        <w:t>student information (roll number,name,calss,section,gardian name)</w:t>
       </w:r>
     </w:p>
     <w:p/>
     <w:p>
       <w:r>
-        <w:t>the tabular structure which contains the following fee amount details:-</w:t>
-      </w:r>
-    </w:p>
-    <w:p>
-      <w:r>
-        <w:t>school fees due</w:t>
-      </w:r>
-    </w:p>
-    <w:p>
-      <w:r>
-        <w:t>school fees paid</w:t>
-      </w:r>
-    </w:p>
-    <w:p>
-      <w:r>
-        <w:t>van fees due</w:t>
-      </w:r>
-    </w:p>
-    <w:p>
-      <w:r>
-        <w:t>van fees paid</w:t>
-      </w:r>
-    </w:p>
-    <w:p>
-      <w:r>
-        <w:t>payment date</w:t>
-      </w:r>
-    </w:p>
+        <w:t>#the tabular structure which contains the following fee amount details:-</w:t>
+      </w:r>
+    </w:p>
+    <w:p>
+      <w:r>
+        <w:t>school fees amount paid(for that transaction)</w:t>
+      </w:r>
+    </w:p>
+    <w:p>
+      <w:r>
+        <w:t>van fees amount paid(for that transaction)</w:t>
+      </w:r>
+    </w:p>
+    <w:p>
+      <w:r>
+        <w:t>discount (if given)</w:t>
+      </w:r>
+    </w:p>
+    <w:p>
+      <w:r>
+        <w:t>total amount (this should include van fees+schoool fees +discount)</w:t>
+      </w:r>
+    </w:p>
+    <w:p/>
+    <w:p>
+      <w:r>
+        <w:t>#include after the table:-</w:t>
+      </w:r>
+    </w:p>
+    <w:p>
+      <w:r>
+        <w:lastRenderedPageBreak/>
+        <w:t>text "thank you for the payment. For any further inquiries, please contact the school management"</w:t>
+      </w:r>
+    </w:p>
+    <w:p/>
+    <w:p>
+      <w:r>
+        <w:t>#exclude:-</w:t>
+      </w:r>
+    </w:p>
+    <w:p>
+      <w:r>
+        <w:t>payment method, payment date mentioned below the table</w:t>
+      </w:r>
+    </w:p>
+    <w:p>
+      <w:r>
+        <w:t>text at the tp right corner of the Sample</w:t>
+      </w:r>
+    </w:p>
+    <w:p/>
+    <w:p>
+      <w:r>
+        <w:t>#customization:-</w:t>
+      </w:r>
+    </w:p>
+    <w:p>
+      <w:r>
+        <w:t>replace the logo in the sample with athe provided school logo</w:t>
+      </w:r>
+    </w:p>
+    <w:p/>
+    <w:p>
+      <w:r>
+        <w:t>add the school name on the top middke in large bold letters with appropriate font style</w:t>
+      </w:r>
+    </w:p>
+    <w:p/>
+    <w:p>
+      <w:r>
+        <w:t>make the page look more appeling</w:t>
+      </w:r>
+    </w:p>
+    <w:p>
+      <w:r>
+        <w:t>change the color pallet if needed to enhance its look</w:t>
+      </w:r>
+    </w:p>
+    <w:p/>
+    <w:p/>
     <w:p>
       <w:r>
         <w:rPr>
@@ -1310,7 +1751,6 @@
   <w:style w:type="character" w:default="1" w:styleId="DefaultParagraphFont">
     <w:name w:val="Default Paragraph Font"/>
     <w:uiPriority w:val="1"/>
-    <w:semiHidden/>
     <w:unhideWhenUsed/>
   </w:style>
   <w:style w:type="table" w:default="1" w:styleId="TableNormal">

</xml_diff>

<commit_message>
implemented till payment history
</commit_message>
<xml_diff>
--- a/to-do list.docx
+++ b/to-do list.docx
@@ -1011,6 +1011,15 @@
                 <w:lang w:val="en-GB"/>
               </w:rPr>
             </w:pPr>
+            <w:r>
+              <w:rPr>
+                <w:rFonts w:ascii="Segoe UI Emoji" w:hAnsi="Segoe UI Emoji" w:cs="Segoe UI Emoji"/>
+                <w:sz w:val="44"/>
+                <w:szCs w:val="44"/>
+                <w:lang w:val="en-GB"/>
+              </w:rPr>
+              <w:t>✅</w:t>
+            </w:r>
           </w:p>
         </w:tc>
       </w:tr>
@@ -1054,6 +1063,15 @@
                 <w:lang w:val="en-GB"/>
               </w:rPr>
             </w:pPr>
+            <w:r>
+              <w:rPr>
+                <w:rFonts w:ascii="Segoe UI Emoji" w:hAnsi="Segoe UI Emoji" w:cs="Segoe UI Emoji"/>
+                <w:sz w:val="44"/>
+                <w:szCs w:val="44"/>
+                <w:lang w:val="en-GB"/>
+              </w:rPr>
+              <w:t>✅</w:t>
+            </w:r>
           </w:p>
         </w:tc>
       </w:tr>
@@ -1097,6 +1115,68 @@
                 <w:lang w:val="en-GB"/>
               </w:rPr>
             </w:pPr>
+            <w:r>
+              <w:rPr>
+                <w:rFonts w:ascii="Segoe UI Emoji" w:hAnsi="Segoe UI Emoji" w:cs="Segoe UI Emoji"/>
+                <w:sz w:val="44"/>
+                <w:szCs w:val="44"/>
+                <w:lang w:val="en-GB"/>
+              </w:rPr>
+              <w:t>✅</w:t>
+            </w:r>
+          </w:p>
+        </w:tc>
+      </w:tr>
+      <w:tr>
+        <w:trPr>
+          <w:jc w:val="center"/>
+        </w:trPr>
+        <w:tc>
+          <w:tcPr>
+            <w:tcW w:w="4508" w:type="dxa"/>
+          </w:tcPr>
+          <w:p>
+            <w:pPr>
+              <w:jc w:val="center"/>
+              <w:rPr>
+                <w:sz w:val="44"/>
+                <w:szCs w:val="44"/>
+                <w:lang w:val="en-GB"/>
+              </w:rPr>
+            </w:pPr>
+            <w:r>
+              <w:rPr>
+                <w:sz w:val="44"/>
+                <w:szCs w:val="44"/>
+                <w:lang w:val="en-GB"/>
+              </w:rPr>
+              <w:t>Add Student</w:t>
+            </w:r>
+          </w:p>
+        </w:tc>
+        <w:tc>
+          <w:tcPr>
+            <w:tcW w:w="4508" w:type="dxa"/>
+          </w:tcPr>
+          <w:p>
+            <w:pPr>
+              <w:jc w:val="center"/>
+              <w:rPr>
+                <w:rFonts w:ascii="Segoe UI Emoji" w:hAnsi="Segoe UI Emoji" w:cs="Segoe UI Emoji"/>
+                <w:sz w:val="44"/>
+                <w:szCs w:val="44"/>
+                <w:lang w:val="en-GB"/>
+              </w:rPr>
+            </w:pPr>
+            <w:r>
+              <w:rPr>
+                <w:rFonts w:ascii="Segoe UI Emoji" w:hAnsi="Segoe UI Emoji" w:cs="Segoe UI Emoji"/>
+                <w:sz w:val="44"/>
+                <w:szCs w:val="44"/>
+                <w:lang w:val="en-GB"/>
+              </w:rPr>
+              <w:t>✅</w:t>
+            </w:r>
           </w:p>
         </w:tc>
       </w:tr>
@@ -1391,6 +1471,7 @@
     </w:p>
     <w:p>
       <w:r>
+        <w:lastRenderedPageBreak/>
         <w:t>it should look professional</w:t>
       </w:r>
     </w:p>
@@ -1401,7 +1482,6 @@
     </w:p>
     <w:p>
       <w:r>
-        <w:lastRenderedPageBreak/>
         <w:t>make it interesting</w:t>
       </w:r>
     </w:p>
@@ -1525,118 +1605,119 @@
     </w:p>
     <w:p>
       <w:r>
+        <w:lastRenderedPageBreak/>
         <w:t>##task:-</w:t>
       </w:r>
     </w:p>
     <w:p>
       <w:r>
+        <w:t>in the student window in the collect payment add a new button in between "collect payment" and the "close" button named "print recipt"</w:t>
+      </w:r>
+    </w:p>
+    <w:p>
+      <w:r>
+        <w:t>##purpose of this button:-</w:t>
+      </w:r>
+    </w:p>
+    <w:p>
+      <w:r>
+        <w:t>to generate a recipt of the given format in ther above picture in a pdf form</w:t>
+      </w:r>
+    </w:p>
+    <w:p>
+      <w:r>
+        <w:t>the form should contain the exact same format as the above provided example picture</w:t>
+      </w:r>
+    </w:p>
+    <w:p/>
+    <w:p>
+      <w:r>
+        <w:t xml:space="preserve">##structure of the recipt </w:t>
+      </w:r>
+    </w:p>
+    <w:p/>
+    <w:p>
+      <w:r>
+        <w:t>#include:-</w:t>
+      </w:r>
+    </w:p>
+    <w:p>
+      <w:r>
+        <w:t>date and time of recipt generation</w:t>
+      </w:r>
+    </w:p>
+    <w:p>
+      <w:r>
+        <w:t>the generated recipt number for that recipt</w:t>
+      </w:r>
+    </w:p>
+    <w:p>
+      <w:r>
+        <w:t>student information (roll number,name,calss,section,gardian name)</w:t>
+      </w:r>
+    </w:p>
+    <w:p/>
+    <w:p>
+      <w:r>
+        <w:t>#the tabular structure which contains the following fee amount details:-</w:t>
+      </w:r>
+    </w:p>
+    <w:p>
+      <w:r>
+        <w:t>school fees amount paid(for that transaction)</w:t>
+      </w:r>
+    </w:p>
+    <w:p>
+      <w:r>
+        <w:t>van fees amount paid(for that transaction)</w:t>
+      </w:r>
+    </w:p>
+    <w:p>
+      <w:r>
+        <w:t>discount (if given)</w:t>
+      </w:r>
+    </w:p>
+    <w:p>
+      <w:r>
+        <w:t>total amount (this should include van fees+schoool fees +discount)</w:t>
+      </w:r>
+    </w:p>
+    <w:p/>
+    <w:p>
+      <w:r>
+        <w:t>#include after the table:-</w:t>
+      </w:r>
+    </w:p>
+    <w:p>
+      <w:r>
+        <w:t>text "thank you for the payment. For any further inquiries, please contact the school management"</w:t>
+      </w:r>
+    </w:p>
+    <w:p/>
+    <w:p>
+      <w:r>
+        <w:t>#exclude:-</w:t>
+      </w:r>
+    </w:p>
+    <w:p>
+      <w:r>
+        <w:t>payment method, payment date mentioned below the table</w:t>
+      </w:r>
+    </w:p>
+    <w:p>
+      <w:r>
+        <w:t>text at the tp right corner of the Sample</w:t>
+      </w:r>
+    </w:p>
+    <w:p/>
+    <w:p>
+      <w:r>
+        <w:t>#customization:-</w:t>
+      </w:r>
+    </w:p>
+    <w:p>
+      <w:r>
         <w:lastRenderedPageBreak/>
-        <w:t>in the student window in the collect payment add a new button in between "collect payment" and the "close" button named "print recipt"</w:t>
-      </w:r>
-    </w:p>
-    <w:p>
-      <w:r>
-        <w:t>##purpose of this button:-</w:t>
-      </w:r>
-    </w:p>
-    <w:p>
-      <w:r>
-        <w:t>to generate a recipt of the given format in ther above picture in a pdf form</w:t>
-      </w:r>
-    </w:p>
-    <w:p>
-      <w:r>
-        <w:t>the form should contain the exact same format as the above provided example picture</w:t>
-      </w:r>
-    </w:p>
-    <w:p/>
-    <w:p>
-      <w:r>
-        <w:t xml:space="preserve">##structure of the recipt </w:t>
-      </w:r>
-    </w:p>
-    <w:p/>
-    <w:p>
-      <w:r>
-        <w:t>#include:-</w:t>
-      </w:r>
-    </w:p>
-    <w:p>
-      <w:r>
-        <w:t>date and time of recipt generation</w:t>
-      </w:r>
-    </w:p>
-    <w:p>
-      <w:r>
-        <w:t>the generated recipt number for that recipt</w:t>
-      </w:r>
-    </w:p>
-    <w:p>
-      <w:r>
-        <w:t>student information (roll number,name,calss,section,gardian name)</w:t>
-      </w:r>
-    </w:p>
-    <w:p/>
-    <w:p>
-      <w:r>
-        <w:t>#the tabular structure which contains the following fee amount details:-</w:t>
-      </w:r>
-    </w:p>
-    <w:p>
-      <w:r>
-        <w:t>school fees amount paid(for that transaction)</w:t>
-      </w:r>
-    </w:p>
-    <w:p>
-      <w:r>
-        <w:t>van fees amount paid(for that transaction)</w:t>
-      </w:r>
-    </w:p>
-    <w:p>
-      <w:r>
-        <w:t>discount (if given)</w:t>
-      </w:r>
-    </w:p>
-    <w:p>
-      <w:r>
-        <w:t>total amount (this should include van fees+schoool fees +discount)</w:t>
-      </w:r>
-    </w:p>
-    <w:p/>
-    <w:p>
-      <w:r>
-        <w:t>#include after the table:-</w:t>
-      </w:r>
-    </w:p>
-    <w:p>
-      <w:r>
-        <w:t>text "thank you for the payment. For any further inquiries, please contact the school management"</w:t>
-      </w:r>
-    </w:p>
-    <w:p/>
-    <w:p>
-      <w:r>
-        <w:t>#exclude:-</w:t>
-      </w:r>
-    </w:p>
-    <w:p>
-      <w:r>
-        <w:t>payment method, payment date mentioned below the table</w:t>
-      </w:r>
-    </w:p>
-    <w:p>
-      <w:r>
-        <w:t>text at the tp right corner of the Sample</w:t>
-      </w:r>
-    </w:p>
-    <w:p/>
-    <w:p>
-      <w:r>
-        <w:t>#customization:-</w:t>
-      </w:r>
-    </w:p>
-    <w:p>
-      <w:r>
         <w:t>replace the logo in the sample with athe provided school logo</w:t>
       </w:r>
     </w:p>

</xml_diff>

<commit_message>
miscellaneous tab and exporting
</commit_message>
<xml_diff>
--- a/to-do list.docx
+++ b/to-do list.docx
@@ -768,6 +768,14 @@
                 <w:szCs w:val="44"/>
               </w:rPr>
             </w:pPr>
+            <w:r>
+              <w:rPr>
+                <w:rFonts w:ascii="Segoe UI Emoji" w:hAnsi="Segoe UI Emoji" w:cs="Segoe UI Emoji"/>
+                <w:sz w:val="44"/>
+                <w:szCs w:val="44"/>
+              </w:rPr>
+              <w:t>✅</w:t>
+            </w:r>
           </w:p>
         </w:tc>
       </w:tr>
@@ -806,6 +814,14 @@
                 <w:szCs w:val="44"/>
               </w:rPr>
             </w:pPr>
+            <w:r>
+              <w:rPr>
+                <w:rFonts w:ascii="Segoe UI Emoji" w:hAnsi="Segoe UI Emoji" w:cs="Segoe UI Emoji"/>
+                <w:sz w:val="44"/>
+                <w:szCs w:val="44"/>
+              </w:rPr>
+              <w:t>✅</w:t>
+            </w:r>
           </w:p>
         </w:tc>
       </w:tr>
@@ -1326,6 +1342,15 @@
                 <w:lang w:val="en-GB"/>
               </w:rPr>
             </w:pPr>
+            <w:r>
+              <w:rPr>
+                <w:rFonts w:ascii="Segoe UI Emoji" w:hAnsi="Segoe UI Emoji" w:cs="Segoe UI Emoji"/>
+                <w:sz w:val="44"/>
+                <w:szCs w:val="44"/>
+                <w:lang w:val="en-GB"/>
+              </w:rPr>
+              <w:t>✅</w:t>
+            </w:r>
           </w:p>
         </w:tc>
       </w:tr>
@@ -1352,6 +1377,253 @@
                 <w:szCs w:val="44"/>
                 <w:lang w:val="en-GB"/>
               </w:rPr>
+              <w:t>Salary</w:t>
+            </w:r>
+          </w:p>
+        </w:tc>
+        <w:tc>
+          <w:tcPr>
+            <w:tcW w:w="4508" w:type="dxa"/>
+          </w:tcPr>
+          <w:p>
+            <w:pPr>
+              <w:jc w:val="center"/>
+              <w:rPr>
+                <w:rFonts w:ascii="Segoe UI Emoji" w:hAnsi="Segoe UI Emoji" w:cs="Segoe UI Emoji"/>
+                <w:sz w:val="44"/>
+                <w:szCs w:val="44"/>
+                <w:lang w:val="en-GB"/>
+              </w:rPr>
+            </w:pPr>
+            <w:r>
+              <w:rPr>
+                <w:rFonts w:ascii="Segoe UI Emoji" w:hAnsi="Segoe UI Emoji" w:cs="Segoe UI Emoji"/>
+                <w:sz w:val="44"/>
+                <w:szCs w:val="44"/>
+                <w:lang w:val="en-GB"/>
+              </w:rPr>
+              <w:t>✅</w:t>
+            </w:r>
+          </w:p>
+        </w:tc>
+      </w:tr>
+      <w:tr>
+        <w:trPr>
+          <w:jc w:val="center"/>
+        </w:trPr>
+        <w:tc>
+          <w:tcPr>
+            <w:tcW w:w="4508" w:type="dxa"/>
+          </w:tcPr>
+          <w:p>
+            <w:pPr>
+              <w:jc w:val="center"/>
+              <w:rPr>
+                <w:sz w:val="44"/>
+                <w:szCs w:val="44"/>
+                <w:lang w:val="en-GB"/>
+              </w:rPr>
+            </w:pPr>
+            <w:r>
+              <w:rPr>
+                <w:sz w:val="44"/>
+                <w:szCs w:val="44"/>
+                <w:lang w:val="en-GB"/>
+              </w:rPr>
+              <w:t>Salary Control</w:t>
+            </w:r>
+          </w:p>
+        </w:tc>
+        <w:tc>
+          <w:tcPr>
+            <w:tcW w:w="4508" w:type="dxa"/>
+          </w:tcPr>
+          <w:p>
+            <w:pPr>
+              <w:jc w:val="center"/>
+              <w:rPr>
+                <w:rFonts w:ascii="Segoe UI Emoji" w:hAnsi="Segoe UI Emoji" w:cs="Segoe UI Emoji"/>
+                <w:sz w:val="44"/>
+                <w:szCs w:val="44"/>
+                <w:lang w:val="en-GB"/>
+              </w:rPr>
+            </w:pPr>
+            <w:r>
+              <w:rPr>
+                <w:rFonts w:ascii="Segoe UI Emoji" w:hAnsi="Segoe UI Emoji" w:cs="Segoe UI Emoji"/>
+                <w:sz w:val="44"/>
+                <w:szCs w:val="44"/>
+                <w:lang w:val="en-GB"/>
+              </w:rPr>
+              <w:t>✅</w:t>
+            </w:r>
+          </w:p>
+        </w:tc>
+      </w:tr>
+      <w:tr>
+        <w:trPr>
+          <w:jc w:val="center"/>
+        </w:trPr>
+        <w:tc>
+          <w:tcPr>
+            <w:tcW w:w="4508" w:type="dxa"/>
+          </w:tcPr>
+          <w:p>
+            <w:pPr>
+              <w:jc w:val="center"/>
+              <w:rPr>
+                <w:sz w:val="44"/>
+                <w:szCs w:val="44"/>
+                <w:lang w:val="en-GB"/>
+              </w:rPr>
+            </w:pPr>
+            <w:r>
+              <w:rPr>
+                <w:sz w:val="44"/>
+                <w:szCs w:val="44"/>
+                <w:lang w:val="en-GB"/>
+              </w:rPr>
+              <w:t>Salary History</w:t>
+            </w:r>
+          </w:p>
+        </w:tc>
+        <w:tc>
+          <w:tcPr>
+            <w:tcW w:w="4508" w:type="dxa"/>
+          </w:tcPr>
+          <w:p>
+            <w:pPr>
+              <w:jc w:val="center"/>
+              <w:rPr>
+                <w:rFonts w:ascii="Segoe UI Emoji" w:hAnsi="Segoe UI Emoji" w:cs="Segoe UI Emoji"/>
+                <w:sz w:val="44"/>
+                <w:szCs w:val="44"/>
+                <w:lang w:val="en-GB"/>
+              </w:rPr>
+            </w:pPr>
+            <w:r>
+              <w:rPr>
+                <w:rFonts w:ascii="Segoe UI Emoji" w:hAnsi="Segoe UI Emoji" w:cs="Segoe UI Emoji"/>
+                <w:sz w:val="44"/>
+                <w:szCs w:val="44"/>
+                <w:lang w:val="en-GB"/>
+              </w:rPr>
+              <w:t>--One payment per month--</w:t>
+            </w:r>
+          </w:p>
+        </w:tc>
+      </w:tr>
+      <w:tr>
+        <w:trPr>
+          <w:jc w:val="center"/>
+        </w:trPr>
+        <w:tc>
+          <w:tcPr>
+            <w:tcW w:w="4508" w:type="dxa"/>
+          </w:tcPr>
+          <w:p>
+            <w:pPr>
+              <w:jc w:val="center"/>
+              <w:rPr>
+                <w:sz w:val="44"/>
+                <w:szCs w:val="44"/>
+                <w:lang w:val="en-GB"/>
+              </w:rPr>
+            </w:pPr>
+            <w:r>
+              <w:rPr>
+                <w:sz w:val="44"/>
+                <w:szCs w:val="44"/>
+                <w:lang w:val="en-GB"/>
+              </w:rPr>
+              <w:t>Other</w:t>
+            </w:r>
+          </w:p>
+        </w:tc>
+        <w:tc>
+          <w:tcPr>
+            <w:tcW w:w="4508" w:type="dxa"/>
+          </w:tcPr>
+          <w:p>
+            <w:pPr>
+              <w:jc w:val="center"/>
+              <w:rPr>
+                <w:rFonts w:ascii="Segoe UI Emoji" w:hAnsi="Segoe UI Emoji" w:cs="Segoe UI Emoji"/>
+                <w:sz w:val="44"/>
+                <w:szCs w:val="44"/>
+                <w:lang w:val="en-GB"/>
+              </w:rPr>
+            </w:pPr>
+          </w:p>
+        </w:tc>
+      </w:tr>
+      <w:tr>
+        <w:trPr>
+          <w:jc w:val="center"/>
+        </w:trPr>
+        <w:tc>
+          <w:tcPr>
+            <w:tcW w:w="4508" w:type="dxa"/>
+          </w:tcPr>
+          <w:p>
+            <w:pPr>
+              <w:jc w:val="center"/>
+              <w:rPr>
+                <w:sz w:val="44"/>
+                <w:szCs w:val="44"/>
+                <w:lang w:val="en-GB"/>
+              </w:rPr>
+            </w:pPr>
+            <w:r>
+              <w:rPr>
+                <w:sz w:val="44"/>
+                <w:szCs w:val="44"/>
+                <w:lang w:val="en-GB"/>
+              </w:rPr>
+              <w:t>Add faculty</w:t>
+            </w:r>
+          </w:p>
+        </w:tc>
+        <w:tc>
+          <w:tcPr>
+            <w:tcW w:w="4508" w:type="dxa"/>
+          </w:tcPr>
+          <w:p>
+            <w:pPr>
+              <w:jc w:val="center"/>
+              <w:rPr>
+                <w:rFonts w:ascii="Segoe UI Emoji" w:hAnsi="Segoe UI Emoji" w:cs="Segoe UI Emoji"/>
+                <w:sz w:val="44"/>
+                <w:szCs w:val="44"/>
+                <w:lang w:val="en-GB"/>
+              </w:rPr>
+            </w:pPr>
+          </w:p>
+        </w:tc>
+      </w:tr>
+      <w:tr>
+        <w:trPr>
+          <w:jc w:val="center"/>
+        </w:trPr>
+        <w:tc>
+          <w:tcPr>
+            <w:tcW w:w="4508" w:type="dxa"/>
+          </w:tcPr>
+          <w:p>
+            <w:pPr>
+              <w:jc w:val="center"/>
+              <w:rPr>
+                <w:sz w:val="44"/>
+                <w:szCs w:val="44"/>
+                <w:lang w:val="en-GB"/>
+              </w:rPr>
+            </w:pPr>
+            <w:r>
+              <w:rPr>
+                <w:sz w:val="44"/>
+                <w:szCs w:val="44"/>
+                <w:lang w:val="en-GB"/>
+              </w:rPr>
               <w:t xml:space="preserve">Repots </w:t>
             </w:r>
           </w:p>
@@ -1369,6 +1641,15 @@
                 <w:lang w:val="en-GB"/>
               </w:rPr>
             </w:pPr>
+            <w:r>
+              <w:rPr>
+                <w:rFonts w:ascii="Segoe UI Emoji" w:hAnsi="Segoe UI Emoji" w:cs="Segoe UI Emoji"/>
+                <w:sz w:val="44"/>
+                <w:szCs w:val="44"/>
+                <w:lang w:val="en-GB"/>
+              </w:rPr>
+              <w:t>✅</w:t>
+            </w:r>
           </w:p>
         </w:tc>
       </w:tr>
@@ -1503,80 +1784,32 @@
           <w:u w:val="single"/>
           <w:lang w:val="en-GB"/>
         </w:rPr>
-        <w:t xml:space="preserve">FOR </w:t>
-      </w:r>
-      <w:proofErr w:type="gramStart"/>
-      <w:r>
-        <w:rPr>
-          <w:b/>
-          <w:bCs/>
-          <w:u w:val="single"/>
-          <w:lang w:val="en-GB"/>
-        </w:rPr>
-        <w:t>UI:-</w:t>
-      </w:r>
-      <w:proofErr w:type="gramEnd"/>
-    </w:p>
-    <w:p>
-      <w:proofErr w:type="spellStart"/>
-      <w:r>
-        <w:t>i</w:t>
-      </w:r>
-      <w:proofErr w:type="spellEnd"/>
-      <w:r>
-        <w:t xml:space="preserve"> am giving you full creative control for this specific task</w:t>
-      </w:r>
-    </w:p>
-    <w:p>
-      <w:r>
-        <w:t xml:space="preserve">take all the actions necessary without consulting </w:t>
-      </w:r>
-      <w:proofErr w:type="gramStart"/>
-      <w:r>
-        <w:t>me:-</w:t>
-      </w:r>
-      <w:proofErr w:type="gramEnd"/>
-    </w:p>
-    <w:p>
-      <w:r>
-        <w:t xml:space="preserve">you are a </w:t>
-      </w:r>
-      <w:proofErr w:type="spellStart"/>
-      <w:r>
-        <w:t>develper</w:t>
-      </w:r>
-      <w:proofErr w:type="spellEnd"/>
-      <w:r>
-        <w:t xml:space="preserve"> whose task is to create </w:t>
-      </w:r>
-      <w:proofErr w:type="gramStart"/>
-      <w:r>
-        <w:t>an</w:t>
-      </w:r>
-      <w:proofErr w:type="gramEnd"/>
-      <w:r>
-        <w:t xml:space="preserve"> user interface for this project</w:t>
+        <w:t>FOR UI:-</w:t>
+      </w:r>
+    </w:p>
+    <w:p>
+      <w:r>
+        <w:t>i am giving you full creative control for this specific task</w:t>
+      </w:r>
+    </w:p>
+    <w:p>
+      <w:r>
+        <w:t>take all the actions necessary without consulting me:-</w:t>
+      </w:r>
+    </w:p>
+    <w:p>
+      <w:r>
+        <w:t>you are a develper whose task is to create an user interface for this project</w:t>
       </w:r>
     </w:p>
     <w:p/>
     <w:p>
       <w:r>
-        <w:t xml:space="preserve">points to </w:t>
-      </w:r>
-      <w:proofErr w:type="spellStart"/>
-      <w:proofErr w:type="gramStart"/>
-      <w:r>
-        <w:t>rember</w:t>
-      </w:r>
-      <w:proofErr w:type="spellEnd"/>
-      <w:r>
-        <w:t>:-</w:t>
-      </w:r>
-      <w:proofErr w:type="gramEnd"/>
-    </w:p>
-    <w:p>
-      <w:r>
-        <w:lastRenderedPageBreak/>
+        <w:t>points to rember:-</w:t>
+      </w:r>
+    </w:p>
+    <w:p>
+      <w:r>
         <w:t>the interface should be user friendly</w:t>
       </w:r>
     </w:p>
@@ -1587,13 +1820,8 @@
     </w:p>
     <w:p>
       <w:r>
-        <w:t xml:space="preserve">it should not be boring </w:t>
-      </w:r>
-      <w:proofErr w:type="spellStart"/>
-      <w:r>
-        <w:t>colors</w:t>
-      </w:r>
-      <w:proofErr w:type="spellEnd"/>
+        <w:t>it should not be boring colors</w:t>
+      </w:r>
     </w:p>
     <w:p>
       <w:r>
@@ -1608,13 +1836,8 @@
     <w:p/>
     <w:p>
       <w:r>
-        <w:t xml:space="preserve">incorporate the following </w:t>
-      </w:r>
-      <w:proofErr w:type="gramStart"/>
-      <w:r>
-        <w:t>details:-</w:t>
-      </w:r>
-      <w:proofErr w:type="gramEnd"/>
+        <w:t>incorporate the following details:-</w:t>
+      </w:r>
     </w:p>
     <w:p>
       <w:r>
@@ -1623,165 +1846,46 @@
     </w:p>
     <w:p>
       <w:r>
-        <w:t xml:space="preserve">school </w:t>
-      </w:r>
-      <w:proofErr w:type="spellStart"/>
-      <w:r>
-        <w:t>namehe</w:t>
-      </w:r>
-      <w:proofErr w:type="spellEnd"/>
-      <w:r>
-        <w:t xml:space="preserve"> </w:t>
-      </w:r>
-      <w:proofErr w:type="spellStart"/>
-      <w:r>
-        <w:t>i</w:t>
-      </w:r>
-      <w:proofErr w:type="spellEnd"/>
-      <w:r>
-        <w:t xml:space="preserve"> want to add these following features brainstorm me with </w:t>
-      </w:r>
-      <w:proofErr w:type="spellStart"/>
-      <w:r>
-        <w:t>diffarent</w:t>
-      </w:r>
-      <w:proofErr w:type="spellEnd"/>
-      <w:r>
-        <w:t xml:space="preserve"> </w:t>
-      </w:r>
-      <w:proofErr w:type="gramStart"/>
-      <w:r>
-        <w:t>approaches:-</w:t>
-      </w:r>
-      <w:proofErr w:type="gramEnd"/>
-    </w:p>
-    <w:p>
-      <w:proofErr w:type="spellStart"/>
-      <w:r>
-        <w:t>i</w:t>
-      </w:r>
-      <w:proofErr w:type="spellEnd"/>
-      <w:r>
-        <w:t xml:space="preserve"> want to add an academic year which helps the admin to set thew dates of that </w:t>
-      </w:r>
-      <w:proofErr w:type="spellStart"/>
-      <w:r>
-        <w:t>acedemic</w:t>
-      </w:r>
-      <w:proofErr w:type="spellEnd"/>
-      <w:r>
-        <w:t xml:space="preserve"> year and the next </w:t>
-      </w:r>
-      <w:proofErr w:type="spellStart"/>
-      <w:r>
-        <w:t>acesemic</w:t>
-      </w:r>
-      <w:proofErr w:type="spellEnd"/>
-      <w:r>
-        <w:t xml:space="preserve"> year</w:t>
+        <w:t>school namehe i want to add these following features brainstorm me with diffarent approaches:-</w:t>
+      </w:r>
+    </w:p>
+    <w:p>
+      <w:r>
+        <w:t>i want to add an academic year which helps the admin to set thew dates of that acedemic year and the next acesemic year</w:t>
       </w:r>
     </w:p>
     <w:p/>
     <w:p>
       <w:r>
-        <w:t>#</w:t>
-      </w:r>
-      <w:proofErr w:type="gramStart"/>
-      <w:r>
-        <w:t>what</w:t>
-      </w:r>
-      <w:proofErr w:type="gramEnd"/>
-      <w:r>
-        <w:t xml:space="preserve"> it </w:t>
-      </w:r>
-      <w:proofErr w:type="gramStart"/>
-      <w:r>
-        <w:t>does:-</w:t>
-      </w:r>
-      <w:proofErr w:type="gramEnd"/>
-    </w:p>
-    <w:p>
-      <w:r>
-        <w:t xml:space="preserve">dynamically adjusting the dates of the </w:t>
-      </w:r>
-      <w:proofErr w:type="spellStart"/>
-      <w:r>
-        <w:t>acedemic</w:t>
-      </w:r>
-      <w:proofErr w:type="spellEnd"/>
-      <w:r>
-        <w:t xml:space="preserve"> year</w:t>
-      </w:r>
-    </w:p>
-    <w:p>
-      <w:r>
-        <w:t xml:space="preserve">introduces a fee carryover </w:t>
-      </w:r>
-      <w:proofErr w:type="gramStart"/>
-      <w:r>
-        <w:t>system(</w:t>
-      </w:r>
-      <w:proofErr w:type="gramEnd"/>
-      <w:r>
-        <w:t>adds the last year due fees to the next year)</w:t>
+        <w:t>#what it does:-</w:t>
+      </w:r>
+    </w:p>
+    <w:p>
+      <w:r>
+        <w:t>dynamically adjusting the dates of the acedemic year</w:t>
+      </w:r>
+    </w:p>
+    <w:p>
+      <w:r>
+        <w:t>introduces a fee carryover system(adds the last year due fees to the next year)</w:t>
       </w:r>
     </w:p>
     <w:p/>
     <w:p>
       <w:r>
-        <w:t xml:space="preserve">the </w:t>
-      </w:r>
-      <w:proofErr w:type="spellStart"/>
-      <w:r>
-        <w:t>outsttanding</w:t>
-      </w:r>
-      <w:proofErr w:type="spellEnd"/>
-      <w:r>
-        <w:t xml:space="preserve"> </w:t>
-      </w:r>
-      <w:proofErr w:type="spellStart"/>
-      <w:r>
-        <w:t>froprevious</w:t>
-      </w:r>
-      <w:proofErr w:type="spellEnd"/>
-      <w:r>
-        <w:t xml:space="preserve"> year(s) should be reflected as pending fees</w:t>
+        <w:t>the outsttanding froprevious year(s) should be reflected as pending fees</w:t>
       </w:r>
     </w:p>
     <w:p/>
     <w:p>
       <w:r>
-        <w:t xml:space="preserve">pending fees = previous year(s) </w:t>
-      </w:r>
-      <w:proofErr w:type="spellStart"/>
-      <w:r>
-        <w:t>vanfees</w:t>
-      </w:r>
-      <w:proofErr w:type="spellEnd"/>
-      <w:r>
-        <w:t xml:space="preserve"> + previous year(s) school fees</w:t>
+        <w:t>pending fees = previous year(s) vanfees + previous year(s) school fees</w:t>
       </w:r>
     </w:p>
     <w:p/>
     <w:p>
       <w:r>
-        <w:t xml:space="preserve">it should have the </w:t>
-      </w:r>
-      <w:proofErr w:type="spellStart"/>
-      <w:r>
-        <w:t>cumilative</w:t>
-      </w:r>
-      <w:proofErr w:type="spellEnd"/>
-      <w:r>
-        <w:t xml:space="preserve"> amount of all the previous </w:t>
-      </w:r>
-      <w:proofErr w:type="spellStart"/>
-      <w:r>
-        <w:t>years</w:t>
-      </w:r>
-      <w:proofErr w:type="spellEnd"/>
-      <w:r>
-        <w:t xml:space="preserve"> fees</w:t>
+        <w:t>it should have the cumilative amount of all the previous years fees</w:t>
       </w:r>
     </w:p>
     <w:p/>
@@ -1815,17 +1919,7 @@
           <w:u w:val="single"/>
           <w:lang w:val="en-GB"/>
         </w:rPr>
-        <w:t xml:space="preserve">RECIPT </w:t>
-      </w:r>
-      <w:proofErr w:type="gramStart"/>
-      <w:r>
-        <w:rPr>
-          <w:b/>
-          <w:bCs/>
-          <w:u w:val="single"/>
-          <w:lang w:val="en-GB"/>
-        </w:rPr>
-        <w:t>PROPMT</w:t>
+        <w:t>RECIPT PROPMT</w:t>
       </w:r>
       <w:r>
         <w:rPr>
@@ -1836,7 +1930,6 @@
         </w:rPr>
         <w:t>:-</w:t>
       </w:r>
-      <w:proofErr w:type="gramEnd"/>
     </w:p>
     <w:p>
       <w:r>
@@ -1850,328 +1943,141 @@
     </w:p>
     <w:p>
       <w:r>
+        <w:t>if any doubts arise or any additional information is needed clarify first</w:t>
+      </w:r>
+    </w:p>
+    <w:p>
+      <w:r>
+        <w:t>##task:-</w:t>
+      </w:r>
+    </w:p>
+    <w:p>
+      <w:r>
+        <w:t>in the student window in the collect payment add a new button in between "collect payment" and the "close" button named "print recipt"</w:t>
+      </w:r>
+    </w:p>
+    <w:p>
+      <w:r>
+        <w:t>##purpose of this button:-</w:t>
+      </w:r>
+    </w:p>
+    <w:p>
+      <w:r>
+        <w:t>to generate a recipt of the given format in ther above picture in a pdf form</w:t>
+      </w:r>
+    </w:p>
+    <w:p>
+      <w:r>
+        <w:t>the form should contain the exact same format as the above provided example picture</w:t>
+      </w:r>
+    </w:p>
+    <w:p/>
+    <w:p>
+      <w:r>
+        <w:t xml:space="preserve">##structure of the recipt </w:t>
+      </w:r>
+    </w:p>
+    <w:p/>
+    <w:p>
+      <w:r>
+        <w:t>#include:-</w:t>
+      </w:r>
+    </w:p>
+    <w:p>
+      <w:r>
+        <w:t>date and time of recipt generation</w:t>
+      </w:r>
+    </w:p>
+    <w:p>
+      <w:r>
+        <w:t>the generated recipt number for that recipt</w:t>
+      </w:r>
+    </w:p>
+    <w:p>
+      <w:r>
+        <w:t>student information (roll number,name,calss,section,gardian name)</w:t>
+      </w:r>
+    </w:p>
+    <w:p/>
+    <w:p>
+      <w:r>
+        <w:t>#the tabular structure which contains the following fee amount details:-</w:t>
+      </w:r>
+    </w:p>
+    <w:p>
+      <w:r>
+        <w:t>school fees amount paid(for that transaction)</w:t>
+      </w:r>
+    </w:p>
+    <w:p>
+      <w:r>
+        <w:t>van fees amount paid(for that transaction)</w:t>
+      </w:r>
+    </w:p>
+    <w:p>
+      <w:r>
+        <w:t>discount (if given)</w:t>
+      </w:r>
+    </w:p>
+    <w:p>
+      <w:r>
+        <w:t>total amount (this should include van fees+schoool fees +discount)</w:t>
+      </w:r>
+    </w:p>
+    <w:p/>
+    <w:p>
+      <w:r>
+        <w:t>#include after the table:-</w:t>
+      </w:r>
+    </w:p>
+    <w:p>
+      <w:r>
         <w:lastRenderedPageBreak/>
-        <w:t>if any doubts arise or any additional information is needed clarify first</w:t>
-      </w:r>
-    </w:p>
-    <w:p>
-      <w:r>
-        <w:t>##</w:t>
-      </w:r>
-      <w:proofErr w:type="gramStart"/>
-      <w:r>
-        <w:t>task:-</w:t>
-      </w:r>
-      <w:proofErr w:type="gramEnd"/>
-    </w:p>
-    <w:p>
-      <w:r>
-        <w:t xml:space="preserve">in the student window in the collect payment add a new button in between "collect payment" and the "close" button named "print </w:t>
-      </w:r>
-      <w:proofErr w:type="spellStart"/>
-      <w:r>
-        <w:t>recipt</w:t>
-      </w:r>
-      <w:proofErr w:type="spellEnd"/>
-      <w:r>
-        <w:t>"</w:t>
-      </w:r>
-    </w:p>
-    <w:p>
-      <w:r>
-        <w:t xml:space="preserve">##purpose of this </w:t>
-      </w:r>
-      <w:proofErr w:type="gramStart"/>
-      <w:r>
-        <w:t>button:-</w:t>
-      </w:r>
-      <w:proofErr w:type="gramEnd"/>
-    </w:p>
-    <w:p>
-      <w:r>
-        <w:t xml:space="preserve">to generate a </w:t>
-      </w:r>
-      <w:proofErr w:type="spellStart"/>
-      <w:r>
-        <w:t>recipt</w:t>
-      </w:r>
-      <w:proofErr w:type="spellEnd"/>
-      <w:r>
-        <w:t xml:space="preserve"> of the given format in </w:t>
-      </w:r>
-      <w:proofErr w:type="spellStart"/>
-      <w:r>
-        <w:t>ther</w:t>
-      </w:r>
-      <w:proofErr w:type="spellEnd"/>
-      <w:r>
-        <w:t xml:space="preserve"> above picture in a pdf form</w:t>
-      </w:r>
-    </w:p>
-    <w:p>
-      <w:r>
-        <w:t>the form should contain the exact same format as the above provided example picture</w:t>
+        <w:t>text "thank you for the payment. For any further inquiries, please contact the school management"</w:t>
       </w:r>
     </w:p>
     <w:p/>
     <w:p>
       <w:r>
-        <w:t xml:space="preserve">##structure of the </w:t>
-      </w:r>
-      <w:proofErr w:type="spellStart"/>
-      <w:r>
-        <w:t>recipt</w:t>
-      </w:r>
-      <w:proofErr w:type="spellEnd"/>
-      <w:r>
-        <w:t xml:space="preserve"> </w:t>
+        <w:t>#exclude:-</w:t>
+      </w:r>
+    </w:p>
+    <w:p>
+      <w:r>
+        <w:t>payment method, payment date mentioned below the table</w:t>
+      </w:r>
+    </w:p>
+    <w:p>
+      <w:r>
+        <w:t>text at the tp right corner of the Sample</w:t>
       </w:r>
     </w:p>
     <w:p/>
     <w:p>
       <w:r>
-        <w:t>#</w:t>
-      </w:r>
-      <w:proofErr w:type="gramStart"/>
-      <w:r>
-        <w:t>include:-</w:t>
-      </w:r>
-      <w:proofErr w:type="gramEnd"/>
-    </w:p>
-    <w:p>
-      <w:r>
-        <w:t xml:space="preserve">date and time of </w:t>
-      </w:r>
-      <w:proofErr w:type="spellStart"/>
-      <w:r>
-        <w:t>recipt</w:t>
-      </w:r>
-      <w:proofErr w:type="spellEnd"/>
-      <w:r>
-        <w:t xml:space="preserve"> generation</w:t>
-      </w:r>
-    </w:p>
-    <w:p>
-      <w:r>
-        <w:t xml:space="preserve">the generated </w:t>
-      </w:r>
-      <w:proofErr w:type="spellStart"/>
-      <w:r>
-        <w:t>recipt</w:t>
-      </w:r>
-      <w:proofErr w:type="spellEnd"/>
-      <w:r>
-        <w:t xml:space="preserve"> number for that </w:t>
-      </w:r>
-      <w:proofErr w:type="spellStart"/>
-      <w:r>
-        <w:t>recipt</w:t>
-      </w:r>
-      <w:proofErr w:type="spellEnd"/>
-    </w:p>
-    <w:p>
-      <w:r>
-        <w:t xml:space="preserve">student information (roll </w:t>
-      </w:r>
-      <w:proofErr w:type="spellStart"/>
-      <w:proofErr w:type="gramStart"/>
-      <w:r>
-        <w:t>number,name</w:t>
-      </w:r>
-      <w:proofErr w:type="gramEnd"/>
-      <w:r>
-        <w:t>,</w:t>
-      </w:r>
-      <w:proofErr w:type="gramStart"/>
-      <w:r>
-        <w:t>calss,section</w:t>
-      </w:r>
-      <w:proofErr w:type="gramEnd"/>
-      <w:r>
-        <w:t>,gardian</w:t>
-      </w:r>
-      <w:proofErr w:type="spellEnd"/>
-      <w:r>
-        <w:t xml:space="preserve"> name)</w:t>
+        <w:t>#customization:-</w:t>
+      </w:r>
+    </w:p>
+    <w:p>
+      <w:r>
+        <w:t>replace the logo in the sample with athe provided school logo</w:t>
       </w:r>
     </w:p>
     <w:p/>
     <w:p>
       <w:r>
-        <w:t>#</w:t>
-      </w:r>
-      <w:proofErr w:type="gramStart"/>
-      <w:r>
-        <w:t>the</w:t>
-      </w:r>
-      <w:proofErr w:type="gramEnd"/>
-      <w:r>
-        <w:t xml:space="preserve"> tabular structure which contains the following fee amount </w:t>
-      </w:r>
-      <w:proofErr w:type="gramStart"/>
-      <w:r>
-        <w:t>details:-</w:t>
-      </w:r>
-      <w:proofErr w:type="gramEnd"/>
-    </w:p>
-    <w:p>
-      <w:r>
-        <w:t xml:space="preserve">school fees amount </w:t>
-      </w:r>
-      <w:proofErr w:type="gramStart"/>
-      <w:r>
-        <w:t>paid(</w:t>
-      </w:r>
-      <w:proofErr w:type="gramEnd"/>
-      <w:r>
-        <w:t>for that transaction)</w:t>
-      </w:r>
-    </w:p>
-    <w:p>
-      <w:r>
-        <w:t xml:space="preserve">van fees amount </w:t>
-      </w:r>
-      <w:proofErr w:type="gramStart"/>
-      <w:r>
-        <w:t>paid(</w:t>
-      </w:r>
-      <w:proofErr w:type="gramEnd"/>
-      <w:r>
-        <w:t>for that transaction)</w:t>
-      </w:r>
-    </w:p>
-    <w:p>
-      <w:r>
-        <w:t>discount (if given)</w:t>
-      </w:r>
-    </w:p>
-    <w:p>
-      <w:r>
-        <w:t xml:space="preserve">total amount (this should include van </w:t>
-      </w:r>
-      <w:proofErr w:type="spellStart"/>
-      <w:r>
-        <w:t>fees+schoool</w:t>
-      </w:r>
-      <w:proofErr w:type="spellEnd"/>
-      <w:r>
-        <w:t xml:space="preserve"> fees +discount)</w:t>
+        <w:t>add the school name on the top middke in large bold letters with appropriate font style</w:t>
       </w:r>
     </w:p>
     <w:p/>
     <w:p>
       <w:r>
-        <w:t xml:space="preserve">#include after the </w:t>
-      </w:r>
-      <w:proofErr w:type="gramStart"/>
-      <w:r>
-        <w:t>table:-</w:t>
-      </w:r>
-      <w:proofErr w:type="gramEnd"/>
-    </w:p>
-    <w:p>
-      <w:r>
-        <w:t>text "thank you for the payment. For any further inquiries, please contact the school management"</w:t>
-      </w:r>
-    </w:p>
-    <w:p/>
-    <w:p>
-      <w:r>
-        <w:t>#</w:t>
-      </w:r>
-      <w:proofErr w:type="gramStart"/>
-      <w:r>
-        <w:t>exclude:-</w:t>
-      </w:r>
-      <w:proofErr w:type="gramEnd"/>
-    </w:p>
-    <w:p>
-      <w:r>
-        <w:t>payment method, payment date mentioned below the table</w:t>
-      </w:r>
-    </w:p>
-    <w:p>
-      <w:r>
-        <w:t xml:space="preserve">text at the </w:t>
-      </w:r>
-      <w:proofErr w:type="spellStart"/>
-      <w:r>
-        <w:t>tp</w:t>
-      </w:r>
-      <w:proofErr w:type="spellEnd"/>
-      <w:r>
-        <w:t xml:space="preserve"> right corner of the Sample</w:t>
-      </w:r>
-    </w:p>
-    <w:p/>
-    <w:p>
-      <w:r>
-        <w:lastRenderedPageBreak/>
-        <w:t>#</w:t>
-      </w:r>
-      <w:proofErr w:type="gramStart"/>
-      <w:r>
-        <w:t>customization:-</w:t>
-      </w:r>
-      <w:proofErr w:type="gramEnd"/>
-    </w:p>
-    <w:p>
-      <w:r>
-        <w:t xml:space="preserve">replace the logo in the sample with </w:t>
-      </w:r>
-      <w:proofErr w:type="spellStart"/>
-      <w:r>
-        <w:t>athe</w:t>
-      </w:r>
-      <w:proofErr w:type="spellEnd"/>
-      <w:r>
-        <w:t xml:space="preserve"> provided school logo</w:t>
-      </w:r>
-    </w:p>
-    <w:p/>
-    <w:p>
-      <w:r>
-        <w:t xml:space="preserve">add the </w:t>
-      </w:r>
-      <w:proofErr w:type="gramStart"/>
-      <w:r>
-        <w:t>school</w:t>
-      </w:r>
-      <w:proofErr w:type="gramEnd"/>
-      <w:r>
-        <w:t xml:space="preserve"> name on the top </w:t>
-      </w:r>
-      <w:proofErr w:type="spellStart"/>
-      <w:r>
-        <w:t>middke</w:t>
-      </w:r>
-      <w:proofErr w:type="spellEnd"/>
-      <w:r>
-        <w:t xml:space="preserve"> in large bold letters with appropriate font style</w:t>
-      </w:r>
-    </w:p>
-    <w:p/>
-    <w:p>
-      <w:r>
-        <w:t xml:space="preserve">make the page look more </w:t>
-      </w:r>
-      <w:proofErr w:type="spellStart"/>
-      <w:r>
-        <w:t>appeling</w:t>
-      </w:r>
-      <w:proofErr w:type="spellEnd"/>
-    </w:p>
-    <w:p>
-      <w:r>
-        <w:t xml:space="preserve">change the </w:t>
-      </w:r>
-      <w:proofErr w:type="spellStart"/>
-      <w:r>
-        <w:t>color</w:t>
-      </w:r>
-      <w:proofErr w:type="spellEnd"/>
-      <w:r>
-        <w:t xml:space="preserve"> pallet if needed to enhance its look</w:t>
+        <w:t>make the page look more appeling</w:t>
+      </w:r>
+    </w:p>
+    <w:p>
+      <w:r>
+        <w:t>change the color pallet if needed to enhance its look</w:t>
       </w:r>
     </w:p>
     <w:p/>

</xml_diff>